<commit_message>
Fase 14: Galería visual estilo Instagram y diario de ilustraciones (PARETO-008)
</commit_message>
<xml_diff>
--- a/docs/CONTRACT-FASE-8-UX-Y-APARIENCIA.md.docx
+++ b/docs/CONTRACT-FASE-8-UX-Y-APARIENCIA.md.docx
@@ -784,7 +784,7 @@
             <w:sdt>
               <w:sdtPr>
                 <w:alias w:val="Ubicación en Prompt"/>
-                <w:id w:val="836172629"/>
+                <w:id w:val="1133166266"/>
                 <w:dropDownList w:lastValue="Cabecera fija (Companion's body: ...)">
                   <w:listItem w:displayText="Cabecera fija (Companion's body: ...)" w:value="Cabecera fija (Companion's body: ...)"/>
                   <w:listItem w:displayText="Zona dinámica al final del prompt" w:value="Zona dinámica al final del prompt"/>
@@ -884,7 +884,7 @@
             <w:sdt>
               <w:sdtPr>
                 <w:alias w:val="Ubicación en Prompt"/>
-                <w:id w:val="-801996155"/>
+                <w:id w:val="-505002518"/>
                 <w:dropDownList w:lastValue="Zona dinámica al final del prompt">
                   <w:listItem w:displayText="Cabecera fija (Companion's body: ...)" w:value="Cabecera fija (Companion's body: ...)"/>
                   <w:listItem w:displayText="Zona dinámica al final del prompt" w:value="Zona dinámica al final del prompt"/>
@@ -984,7 +984,7 @@
             <w:sdt>
               <w:sdtPr>
                 <w:alias w:val="Ubicación en Prompt"/>
-                <w:id w:val="820948923"/>
+                <w:id w:val="1117942560"/>
                 <w:dropDownList w:lastValue="Zona dinámica al final del prompt">
                   <w:listItem w:displayText="Cabecera fija (Companion's body: ...)" w:value="Cabecera fija (Companion's body: ...)"/>
                   <w:listItem w:displayText="Zona dinámica al final del prompt" w:value="Zona dinámica al final del prompt"/>
@@ -1084,7 +1084,7 @@
             <w:sdt>
               <w:sdtPr>
                 <w:alias w:val="Ubicación en Prompt"/>
-                <w:id w:val="2039969045"/>
+                <w:id w:val="-1958004614"/>
                 <w:dropDownList w:lastValue="Zona dinámica al final del prompt">
                   <w:listItem w:displayText="Cabecera fija (Companion's body: ...)" w:value="Cabecera fija (Companion's body: ...)"/>
                   <w:listItem w:displayText="Zona dinámica al final del prompt" w:value="Zona dinámica al final del prompt"/>

</xml_diff>

<commit_message>
feat: implementar Fase 18 - desacoplamiento generativo Magnum y formato Nomi
</commit_message>
<xml_diff>
--- a/docs/CONTRACT-FASE-8-UX-Y-APARIENCIA.md.docx
+++ b/docs/CONTRACT-FASE-8-UX-Y-APARIENCIA.md.docx
@@ -784,7 +784,7 @@
             <w:sdt>
               <w:sdtPr>
                 <w:alias w:val="Ubicación en Prompt"/>
-                <w:id w:val="-691287820"/>
+                <w:id w:val="876111120"/>
                 <w:dropDownList w:lastValue="Cabecera fija (Companion's body: ...)">
                   <w:listItem w:displayText="Cabecera fija (Companion's body: ...)" w:value="Cabecera fija (Companion's body: ...)"/>
                   <w:listItem w:displayText="Zona dinámica al final del prompt" w:value="Zona dinámica al final del prompt"/>
@@ -884,7 +884,7 @@
             <w:sdt>
               <w:sdtPr>
                 <w:alias w:val="Ubicación en Prompt"/>
-                <w:id w:val="1965510692"/>
+                <w:id w:val="-762057664"/>
                 <w:dropDownList w:lastValue="Zona dinámica al final del prompt">
                   <w:listItem w:displayText="Cabecera fija (Companion's body: ...)" w:value="Cabecera fija (Companion's body: ...)"/>
                   <w:listItem w:displayText="Zona dinámica al final del prompt" w:value="Zona dinámica al final del prompt"/>
@@ -984,7 +984,7 @@
             <w:sdt>
               <w:sdtPr>
                 <w:alias w:val="Ubicación en Prompt"/>
-                <w:id w:val="-706511526"/>
+                <w:id w:val="860887414"/>
                 <w:dropDownList w:lastValue="Zona dinámica al final del prompt">
                   <w:listItem w:displayText="Cabecera fija (Companion's body: ...)" w:value="Cabecera fija (Companion's body: ...)"/>
                   <w:listItem w:displayText="Zona dinámica al final del prompt" w:value="Zona dinámica al final del prompt"/>
@@ -1084,7 +1084,7 @@
             <w:sdt>
               <w:sdtPr>
                 <w:alias w:val="Ubicación en Prompt"/>
-                <w:id w:val="512508596"/>
+                <w:id w:val="2079907536"/>
                 <w:dropDownList w:lastValue="Zona dinámica al final del prompt">
                   <w:listItem w:displayText="Cabecera fija (Companion's body: ...)" w:value="Cabecera fija (Companion's body: ...)"/>
                   <w:listItem w:displayText="Zona dinámica al final del prompt" w:value="Zona dinámica al final del prompt"/>

</xml_diff>

<commit_message>
feat: integracion directa con OpenRouter
</commit_message>
<xml_diff>
--- a/docs/CONTRACT-FASE-8-UX-Y-APARIENCIA.md.docx
+++ b/docs/CONTRACT-FASE-8-UX-Y-APARIENCIA.md.docx
@@ -784,7 +784,7 @@
             <w:sdt>
               <w:sdtPr>
                 <w:alias w:val="Ubicación en Prompt"/>
-                <w:id w:val="876111120"/>
+                <w:id w:val="-977867201"/>
                 <w:dropDownList w:lastValue="Cabecera fija (Companion's body: ...)">
                   <w:listItem w:displayText="Cabecera fija (Companion's body: ...)" w:value="Cabecera fija (Companion's body: ...)"/>
                   <w:listItem w:displayText="Zona dinámica al final del prompt" w:value="Zona dinámica al final del prompt"/>
@@ -884,7 +884,7 @@
             <w:sdt>
               <w:sdtPr>
                 <w:alias w:val="Ubicación en Prompt"/>
-                <w:id w:val="-762057664"/>
+                <w:id w:val="1678931311"/>
                 <w:dropDownList w:lastValue="Zona dinámica al final del prompt">
                   <w:listItem w:displayText="Cabecera fija (Companion's body: ...)" w:value="Cabecera fija (Companion's body: ...)"/>
                   <w:listItem w:displayText="Zona dinámica al final del prompt" w:value="Zona dinámica al final del prompt"/>
@@ -984,7 +984,7 @@
             <w:sdt>
               <w:sdtPr>
                 <w:alias w:val="Ubicación en Prompt"/>
-                <w:id w:val="860887414"/>
+                <w:id w:val="-993090907"/>
                 <w:dropDownList w:lastValue="Zona dinámica al final del prompt">
                   <w:listItem w:displayText="Cabecera fija (Companion's body: ...)" w:value="Cabecera fija (Companion's body: ...)"/>
                   <w:listItem w:displayText="Zona dinámica al final del prompt" w:value="Zona dinámica al final del prompt"/>
@@ -1084,7 +1084,7 @@
             <w:sdt>
               <w:sdtPr>
                 <w:alias w:val="Ubicación en Prompt"/>
-                <w:id w:val="2079907536"/>
+                <w:id w:val="225929215"/>
                 <w:dropDownList w:lastValue="Zona dinámica al final del prompt">
                   <w:listItem w:displayText="Cabecera fija (Companion's body: ...)" w:value="Cabecera fija (Companion's body: ...)"/>
                   <w:listItem w:displayText="Zona dinámica al final del prompt" w:value="Zona dinámica al final del prompt"/>

</xml_diff>